<commit_message>
agrego la clase Tablero .h y .cpp
</commit_message>
<xml_diff>
--- a/Momento1/Analisis.docx
+++ b/Momento1/Analisis.docx
@@ -166,21 +166,7 @@
         <w:rPr>
           <w:lang w:val="es-MX"/>
         </w:rPr>
-        <w:t xml:space="preserve">El tablero estará representado visualmente con puntos, los cuales irán </w:t>
-      </w:r>
-      <w:proofErr w:type="gramStart"/>
-      <w:r>
-        <w:rPr>
-          <w:lang w:val="es-MX"/>
-        </w:rPr>
-        <w:t>cambiando dependiendo</w:t>
-      </w:r>
-      <w:proofErr w:type="gramEnd"/>
-      <w:r>
-        <w:rPr>
-          <w:lang w:val="es-MX"/>
-        </w:rPr>
-        <w:t xml:space="preserve"> de la figura que se esté mostrando o moviendo en ese momento. La forma en que se imprime el tablero en pantalla puede compararse con los </w:t>
+        <w:t xml:space="preserve">El tablero estará representado visualmente con puntos, los cuales irán cambiando dependiendo de la figura que se esté mostrando o moviendo en ese momento. La forma en que se imprime el tablero en pantalla puede compararse con los </w:t>
       </w:r>
       <w:r>
         <w:rPr>
@@ -193,41 +179,37 @@
         <w:rPr>
           <w:lang w:val="es-MX"/>
         </w:rPr>
-        <w:t xml:space="preserve">, donde se realizan muchos dibujos en distintas hojas y al pasar rápidamente las páginas parece que la figura se mueve. De manera similar, el programa estará imprimiendo constantemente el tablero actualizado, generando la sensación de movimiento de las </w:t>
-      </w:r>
-      <w:proofErr w:type="gramStart"/>
-      <w:r>
-        <w:rPr>
-          <w:lang w:val="es-MX"/>
-        </w:rPr>
-        <w:t>piezas</w:t>
-      </w:r>
-      <w:r>
-        <w:rPr>
-          <w:lang w:val="es-MX"/>
-        </w:rPr>
-        <w:t>( por</w:t>
-      </w:r>
-      <w:proofErr w:type="gramEnd"/>
-      <w:r>
-        <w:rPr>
-          <w:lang w:val="es-MX"/>
-        </w:rPr>
-        <w:t xml:space="preserve"> lo cual genera la idea de que el ciclo </w:t>
-      </w:r>
-      <w:proofErr w:type="gramStart"/>
-      <w:r>
-        <w:rPr>
-          <w:lang w:val="es-MX"/>
-        </w:rPr>
-        <w:t>protagonista principal</w:t>
-      </w:r>
-      <w:proofErr w:type="gramEnd"/>
-      <w:r>
-        <w:rPr>
-          <w:lang w:val="es-MX"/>
-        </w:rPr>
-        <w:t xml:space="preserve"> de este código posiblemente será el “While o do While aún no se”)</w:t>
+        <w:t>, donde se realizan muchos dibujos en distintas hojas y al pasar rápidamente las páginas parece que la figura se mueve. De manera similar, el programa estará imprimiendo constantemente el tablero actualizado, generando la sensación de movimiento de las piezas</w:t>
+      </w:r>
+      <w:r>
+        <w:rPr>
+          <w:lang w:val="es-MX"/>
+        </w:rPr>
+        <w:t xml:space="preserve">( por lo cual genera la idea de que el ciclo </w:t>
+      </w:r>
+      <w:r>
+        <w:rPr>
+          <w:lang w:val="es-MX"/>
+        </w:rPr>
+        <w:t>protagonista</w:t>
+      </w:r>
+      <w:r>
+        <w:rPr>
+          <w:lang w:val="es-MX"/>
+        </w:rPr>
+        <w:t xml:space="preserve"> </w:t>
+      </w:r>
+      <w:r>
+        <w:rPr>
+          <w:lang w:val="es-MX"/>
+        </w:rPr>
+        <w:t>z</w:t>
+      </w:r>
+      <w:r>
+        <w:rPr>
+          <w:lang w:val="es-MX"/>
+        </w:rPr>
+        <w:t>de este código posiblemente será el “While o do While aún no se”)</w:t>
       </w:r>
       <w:r>
         <w:rPr>
@@ -285,21 +267,7 @@
         <w:rPr>
           <w:lang w:val="es-MX"/>
         </w:rPr>
-        <w:t>En caso de que las piezas se acumulen hasta llegar a la parte superior del tablero y ya no exista espacio para colocar una nueva figura, el sistema mostrará en pantalla el mensaje “</w:t>
-      </w:r>
-      <w:proofErr w:type="spellStart"/>
-      <w:r>
-        <w:rPr>
-          <w:lang w:val="es-MX"/>
-        </w:rPr>
-        <w:t>Game</w:t>
-      </w:r>
-      <w:proofErr w:type="spellEnd"/>
-      <w:r>
-        <w:rPr>
-          <w:lang w:val="es-MX"/>
-        </w:rPr>
-        <w:t xml:space="preserve"> Over”, indicando que la partida ha terminado.</w:t>
+        <w:t>En caso de que las piezas se acumulen hasta llegar a la parte superior del tablero y ya no exista espacio para colocar una nueva figura, el sistema mostrará en pantalla el mensaje “Game Over”, indicando que la partida ha terminado.</w:t>
       </w:r>
     </w:p>
     <w:p>
@@ -337,39 +305,14 @@
           <w:highlight w:val="yellow"/>
           <w:lang w:val="es-MX"/>
         </w:rPr>
-        <w:t xml:space="preserve">tipo </w:t>
-      </w:r>
-      <w:proofErr w:type="spellStart"/>
-      <w:r>
-        <w:rPr>
-          <w:highlight w:val="yellow"/>
-          <w:lang w:val="es-MX"/>
-        </w:rPr>
-        <w:t>while</w:t>
-      </w:r>
-      <w:proofErr w:type="spellEnd"/>
-      <w:r>
-        <w:rPr>
-          <w:highlight w:val="yellow"/>
-          <w:lang w:val="es-MX"/>
-        </w:rPr>
-        <w:t xml:space="preserve"> o do </w:t>
-      </w:r>
-      <w:proofErr w:type="spellStart"/>
-      <w:r>
-        <w:rPr>
-          <w:highlight w:val="yellow"/>
-          <w:lang w:val="es-MX"/>
-        </w:rPr>
-        <w:t>while</w:t>
-      </w:r>
-      <w:proofErr w:type="spellEnd"/>
-      <w:r>
-        <w:rPr>
-          <w:highlight w:val="yellow"/>
-          <w:lang w:val="es-MX"/>
-        </w:rPr>
-        <w:t xml:space="preserve"> como</w:t>
+        <w:t>tipo while</w:t>
+      </w:r>
+      <w:r>
+        <w:rPr>
+          <w:highlight w:val="yellow"/>
+          <w:lang w:val="es-MX"/>
+        </w:rPr>
+        <w:t xml:space="preserve"> o do while como</w:t>
       </w:r>
       <w:r>
         <w:rPr>
@@ -397,7 +340,6 @@
         </w:rPr>
         <w:t xml:space="preserve">un </w:t>
       </w:r>
-      <w:proofErr w:type="spellStart"/>
       <w:r>
         <w:rPr>
           <w:highlight w:val="yellow"/>
@@ -410,25 +352,8 @@
           <w:highlight w:val="yellow"/>
           <w:lang w:val="es-MX"/>
         </w:rPr>
-        <w:t>ame</w:t>
-      </w:r>
-      <w:proofErr w:type="spellEnd"/>
-      <w:r>
-        <w:rPr>
-          <w:highlight w:val="yellow"/>
-          <w:lang w:val="es-MX"/>
-        </w:rPr>
-        <w:t xml:space="preserve"> </w:t>
-      </w:r>
-      <w:proofErr w:type="spellStart"/>
-      <w:r>
-        <w:rPr>
-          <w:highlight w:val="yellow"/>
-          <w:lang w:val="es-MX"/>
-        </w:rPr>
-        <w:t>over</w:t>
-      </w:r>
-      <w:proofErr w:type="spellEnd"/>
+        <w:t>ame over</w:t>
+      </w:r>
       <w:r>
         <w:rPr>
           <w:lang w:val="es-MX"/>
@@ -466,21 +391,7 @@
         <w:rPr>
           <w:lang w:val="es-MX"/>
         </w:rPr>
-        <w:t xml:space="preserve">Dentro de este ciclo principal se podrán utilizar otros ciclos adicionales, como ciclos </w:t>
-      </w:r>
-      <w:proofErr w:type="spellStart"/>
-      <w:r>
-        <w:rPr>
-          <w:lang w:val="es-MX"/>
-        </w:rPr>
-        <w:t>for</w:t>
-      </w:r>
-      <w:proofErr w:type="spellEnd"/>
-      <w:r>
-        <w:rPr>
-          <w:lang w:val="es-MX"/>
-        </w:rPr>
-        <w:t xml:space="preserve"> anidados, los cuales permitirán recorrer las posiciones del tablero para imprimirlo correctamente en pantalla. Inicialmente, el programa </w:t>
+        <w:t xml:space="preserve">Dentro de este ciclo principal se podrán utilizar otros ciclos adicionales, como ciclos for anidados, los cuales permitirán recorrer las posiciones del tablero para imprimirlo correctamente en pantalla. Inicialmente, el programa </w:t>
       </w:r>
       <w:r>
         <w:rPr>
@@ -568,7 +479,6 @@
         </w:rPr>
         <w:t xml:space="preserve"> máscaras </w:t>
       </w:r>
-      <w:proofErr w:type="gramStart"/>
       <w:r>
         <w:rPr>
           <w:highlight w:val="yellow"/>
@@ -583,7 +493,6 @@
         </w:rPr>
         <w:t xml:space="preserve"> bits</w:t>
       </w:r>
-      <w:proofErr w:type="gramEnd"/>
       <w:r>
         <w:rPr>
           <w:lang w:val="es-MX"/>

</xml_diff>